<commit_message>
Statut COA : SAFIA SAS est aussi courtier en assurance depuis le 9 octobre 2026
Textes valides par Maxime. Mentions legales, CGU et avertissement repris
dans les documents Word puis reconvertis : immatriculation COA, CNCGP
agreee par l AMF et l ACPR, controle de l ACPR, information avant
souscription, Mediation de l Assurance. Pied de page, accueil, fondateur,
securite, institutions, encadre auteur des articles, llms.txt, donnees
structurees et deux descriptions suivent.

Les phrases sur l absence de commission ne changent pas : hypothese
consignee dans les points ouverts.

Co-Authored-By: Claude Opus 5.5 <noreply@anthropic.com>
</commit_message>
<xml_diff>
--- a/reference/pages-legales/CGU SAFIA  12 août 2026.docx
+++ b/reference/pages-legales/CGU SAFIA  12 août 2026.docx
@@ -1932,47 +1932,46 @@
         <w:rPr>
           <w:lang w:val="fr-FR"/>
         </w:rPr>
-        <w:t>Activité réglementée de Conseiller en Investissements Financiers (CIF)</w:t>
-      </w:r>
-    </w:p>
-    <w:p>
-      <w:pPr>
-        <w:rPr>
-          <w:lang w:val="fr-FR"/>
-        </w:rPr>
-      </w:pPr>
-      <w:r>
-        <w:rPr>
-          <w:lang w:val="fr-FR"/>
-        </w:rPr>
-        <w:lastRenderedPageBreak/>
-        <w:t>SAFIA SAS est immatriculée au registre unique des intermédiaires en assurance, banque et finance tenu par l'ORIAS sous le numéro 26008152, en qualité de Conseiller en Investissements Financiers (CIF), sans maniement de fonds. SAFIA SAS est adhérente de la Chambre Nationale des Conseils en Gestion de Patrimoine (CNCGP), association agréée par l'Autorité des Marchés Financiers (AMF).</w:t>
-      </w:r>
-    </w:p>
-    <w:p>
-      <w:pPr>
-        <w:rPr>
-          <w:lang w:val="fr-FR"/>
-        </w:rPr>
-      </w:pPr>
-      <w:r>
-        <w:rPr>
-          <w:lang w:val="fr-FR"/>
-        </w:rPr>
-        <w:t>Cette activité réglementée est exercée exclusivement par les conseillers salariés de SAFIA habilités à cet effet, dans le cadre d'échanges personnalisés et dédiés avec l'utilisateur, distincts de l'utilisation autonome des fonctionnalités de l'application.</w:t>
-      </w:r>
-    </w:p>
-    <w:p>
-      <w:pPr>
-        <w:rPr>
-          <w:lang w:val="fr-FR"/>
-        </w:rPr>
-      </w:pPr>
-      <w:r>
-        <w:rPr>
-          <w:lang w:val="fr-FR"/>
-        </w:rPr>
-        <w:t>Lorsqu'un utilisateur sollicite un tel accompagnement, des documents et informations spécifiques à cette prestation réglementée (notamment relatifs au caractère indépendant ou non du conseil fourni) lui sont communiqués préalablement à toute prestation de conseil, conformément à la réglementation applicable.</w:t>
+        <w:t xml:space="preserve">Activités réglementées de CIF et de Courtier en assurance (COA)</w:t>
+      </w:r>
+    </w:p>
+    <w:p>
+      <w:pPr>
+        <w:rPr>
+          <w:lang w:val="fr-FR"/>
+        </w:rPr>
+      </w:pPr>
+      <w:r>
+        <w:rPr>
+          <w:lang w:val="fr-FR"/>
+        </w:rPr>
+        <w:t xml:space="preserve">SAFIA SAS est immatriculée au registre unique des intermédiaires en assurance, banque et finance tenu par l'ORIAS sous le numéro 26008152, en qualité de Conseiller en Investissements Financiers (CIF), sans maniement de fonds, et de Courtier d'assurance ou de réassurance (COA). SAFIA SAS est adhérente de la Chambre Nationale des Conseils en Gestion de Patrimoine (CNCGP), association agréée par l'Autorité des Marchés Financiers (AMF) et par l'Autorité de Contrôle Prudentiel et de Résolution (ACPR).</w:t>
+      </w:r>
+    </w:p>
+    <w:p>
+      <w:pPr>
+        <w:rPr>
+          <w:lang w:val="fr-FR"/>
+        </w:rPr>
+      </w:pPr>
+      <w:r>
+        <w:rPr>
+          <w:lang w:val="fr-FR"/>
+        </w:rPr>
+        <w:t xml:space="preserve">Ces activités réglementées sont exercées exclusivement par les conseillers salariés de SAFIA habilités à cet effet, dans le cadre d'échanges personnalisés et dédiés avec l'utilisateur, distincts de l'utilisation autonome des fonctionnalités de l'application.</w:t>
+      </w:r>
+    </w:p>
+    <w:p>
+      <w:pPr>
+        <w:rPr>
+          <w:lang w:val="fr-FR"/>
+        </w:rPr>
+      </w:pPr>
+      <w:r>
+        <w:rPr>
+          <w:lang w:val="fr-FR"/>
+        </w:rPr>
+        <w:t xml:space="preserve">Lorsqu'un utilisateur sollicite un tel accompagnement, des documents et informations spécifiques à cette prestation réglementée (notamment relatifs au caractère indépendant ou non du conseil fourni) lui sont communiqués préalablement à toute prestation de conseil, conformément à la réglementation applicable. Avant toute souscription d'un contrat d'assurance, les informations prévues par le Code des assurances lui sont communiquées de la même manière.</w:t>
       </w:r>
     </w:p>
     <w:p>
@@ -1998,37 +1997,7 @@
         <w:rPr>
           <w:lang w:val="fr-FR"/>
         </w:rPr>
-        <w:t>Conformément à la réglementation applicable, tout utilisateur ayant recours à cette prestation dispose, en cas de litige non résolu à l'amiable, de la faculté de saisir gratuitement le Médiateur de l'Autorité des Marchés Financiers (AMF)</w:t>
-      </w:r>
-      <w:r>
-        <w:rPr>
-          <w:lang w:val="fr-FR"/>
-        </w:rPr>
-        <w:t xml:space="preserve">, </w:t>
-      </w:r>
-      <w:r>
-        <w:rPr>
-          <w:lang w:val="fr-FR"/>
-        </w:rPr>
-        <w:t xml:space="preserve">17 place de la Bourse, 75082 Paris Cedex 02 </w:t>
-      </w:r>
-      <w:r>
-        <w:rPr>
-          <w:lang w:val="fr-FR"/>
-        </w:rPr>
-        <w:t>(</w:t>
-      </w:r>
-      <w:r>
-        <w:rPr>
-          <w:lang w:val="fr-FR"/>
-        </w:rPr>
-        <w:t>www.amf-france.org/fr/le-mediateur-de-lamf</w:t>
-      </w:r>
-      <w:r>
-        <w:rPr>
-          <w:lang w:val="fr-FR"/>
-        </w:rPr>
-        <w:t>)</w:t>
+        <w:t xml:space="preserve">Conformément à la réglementation applicable, tout utilisateur ayant recours à ces prestations dispose, en cas de litige non résolu à l'amiable, de la faculté de saisir gratuitement, pour le conseil en investissements financiers, le Médiateur de l'Autorité des Marchés Financiers (AMF), 17 place de la Bourse, 75082 Paris Cedex 02 (www.amf-france.org/fr/le-mediateur-de-lamf), et, pour le courtage en assurance, La Médiation de l'Assurance, TSA 50110, 75441 Paris Cedex 09 (www.mediation-assurance.org).</w:t>
       </w:r>
     </w:p>
     <w:p>

</xml_diff>